<commit_message>
ca11 answering, opening, reply briefs: docx/render.sh (its awk page map, footers and two passes), make-reference.sh and reference.docx give way to fb render: docx/reference.xml (base="xengine" with the builder's arguments) and ca11.lua writing its needles in document order (each needle placed by its top-level block) with #section lines (C-, lower roman, decimal), its footers in $FORMBOOK_FOOTERS and the last section in $FORMBOOK_FINAL; baseline entries removed. Every .docx.pdf byte-identical to the render before the port; check.sh typst, latex and docx 0 failed, XENG-001..003 pass (fb-595.68.2)
</commit_message>
<xml_diff>
--- a/courts/eleventh-circuit/court-of-appeals/answering-brief/usage/OUTPUT-answering-brief.docx
+++ b/courts/eleventh-circuit/court-of-appeals/answering-brief/usage/OUTPUT-answering-brief.docx
@@ -5296,7 +5296,7 @@
       </w:tr>
     </w:tbl>
     <w:sectPr>
-      <w:footerReference w:type="default" r:id="rIdFooter1"/>
+      <w:footerReference w:type="default" r:id="rIdFtrEnd"/>
       <w:pgSz w:w="12240" w:h="15840"/>
       <w:pgMar w:top="1440" w:right="1440" w:bottom="1440" w:left="1440" w:header="720" w:footer="608" w:gutter="0"/>
     </w:sectPr>
@@ -5413,7 +5413,58 @@
 </w:footnotes>
 </file>
 
-<file path=word/ftr-body.xml><?xml version="1.0" encoding="utf-8"?>
+<file path=word/ftr-add.xml><?xml version="1.0" encoding="utf-8"?>
+<w:ftr xmlns:w="http://schemas.openxmlformats.org/wordprocessingml/2006/main" xmlns:r="http://schemas.openxmlformats.org/officeDocument/2006/relationships">
+  <w:p>
+    <w:pPr>
+      <w:spacing w:before="0" w:after="0"/>
+      <w:jc w:val="center"/>
+    </w:pPr>
+    <w:r>
+      <w:t>Add-</w:t>
+    </w:r>
+    <w:r>
+      <w:fldChar w:fldCharType="begin"/>
+    </w:r>
+    <w:r>
+      <w:instrText xml:space="preserve"> PAGE </w:instrText>
+    </w:r>
+    <w:r>
+      <w:fldChar w:fldCharType="separate"/>
+    </w:r>
+    <w:r>
+      <w:t>1</w:t>
+    </w:r>
+    <w:r>
+      <w:fldChar w:fldCharType="end"/>
+    </w:r>
+  </w:p>
+</w:ftr>
+</file>
+
+<file path=word/ftr-none.xml><?xml version="1.0" encoding="utf-8"?>
+<w:ftr xmlns:w="http://schemas.openxmlformats.org/wordprocessingml/2006/main" xmlns:r="http://schemas.openxmlformats.org/officeDocument/2006/relationships">
+  <w:p>
+    <w:pPr>
+      <w:spacing w:before="0" w:after="0"/>
+      <w:jc w:val="center"/>
+    </w:pPr>
+  </w:p>
+</w:ftr>
+</file>
+
+<file path=word/ftr-own1.xml><?xml version="1.0" encoding="utf-8"?>
+<w:ftr xmlns:w="http://schemas.openxmlformats.org/wordprocessingml/2006/main" xmlns:r="http://schemas.openxmlformats.org/officeDocument/2006/relationships">
+  <w:p>
+    <w:pPr>
+      <w:spacing w:before="0" w:after="0" w:line="400" w:lineRule="exact"/>
+      <w:jc w:val="center"/>
+    </w:pPr>
+  </w:p>
+</w:ftr>
+</file>
+
+<file path=word/ftr-own2.xml><?xml version="1.0" encoding="utf-8"?>
 <w:ftr xmlns:w="http://schemas.openxmlformats.org/wordprocessingml/2006/main" xmlns:r="http://schemas.openxmlformats.org/officeDocument/2006/relationships">
   <w:p>
     <w:pPr>
@@ -5439,16 +5490,13 @@
 </w:ftr>
 </file>
 
-<file path=word/ftr-cip.xml><?xml version="1.0" encoding="utf-8"?>
+<file path=word/ftr-own3.xml><?xml version="1.0" encoding="utf-8"?>
 <w:ftr xmlns:w="http://schemas.openxmlformats.org/wordprocessingml/2006/main" xmlns:r="http://schemas.openxmlformats.org/officeDocument/2006/relationships">
   <w:p>
     <w:pPr>
       <w:spacing w:before="0" w:after="0" w:line="400" w:lineRule="exact"/>
       <w:jc w:val="center"/>
     </w:pPr>
-    <w:r>
-      <w:t xml:space="preserve">C-</w:t>
-    </w:r>
     <w:r>
       <w:fldChar w:fldCharType="begin"/>
     </w:r>
@@ -5468,22 +5516,36 @@
 </w:ftr>
 </file>
 
-<file path=word/ftr-cover.xml><?xml version="1.0" encoding="utf-8"?>
+<file path=word/ftr-own4.xml><?xml version="1.0" encoding="utf-8"?>
 <w:ftr xmlns:w="http://schemas.openxmlformats.org/wordprocessingml/2006/main" xmlns:r="http://schemas.openxmlformats.org/officeDocument/2006/relationships">
   <w:p>
     <w:pPr>
-      <w:spacing w:before="0" w:after="0" w:line="400" w:lineRule="exact"/>
       <w:jc w:val="center"/>
     </w:pPr>
+    <w:r>
+      <w:fldChar w:fldCharType="begin"/>
+    </w:r>
+    <w:r>
+      <w:instrText xml:space="preserve"> PAGE </w:instrText>
+    </w:r>
+    <w:r>
+      <w:fldChar w:fldCharType="separate"/>
+    </w:r>
+    <w:r>
+      <w:t>1</w:t>
+    </w:r>
+    <w:r>
+      <w:fldChar w:fldCharType="end"/>
+    </w:r>
   </w:p>
 </w:ftr>
 </file>
 
-<file path=word/ftr-front.xml><?xml version="1.0" encoding="utf-8"?>
+<file path=word/ftr-page.xml><?xml version="1.0" encoding="utf-8"?>
 <w:ftr xmlns:w="http://schemas.openxmlformats.org/wordprocessingml/2006/main" xmlns:r="http://schemas.openxmlformats.org/officeDocument/2006/relationships">
   <w:p>
     <w:pPr>
-      <w:spacing w:before="0" w:after="0" w:line="400" w:lineRule="exact"/>
+      <w:spacing w:before="0" w:after="0"/>
       <w:jc w:val="center"/>
     </w:pPr>
     <w:r>

</xml_diff>

<commit_message>
fix(docx): CA11 and NMI docx renders on master code; Vermont brief-on-the-merits latex re-rendered (fb-595.90)
- CA11 answering/opening/reply ca11.lua wrote body citation needles as kind T, which
  docxpages.rs now reads as a line-position needle (lib/docx/xdoc.lua fills): the
  tables printed yMax values (254.924) as pages, or the lookup failed. Body kind is B.
- docxpages.rs: a note-kind heading needle equal to the heading's before it (two
  headings kept with one block, NMI motion-brief "Legal Standard"/"Party Standard")
  is found where that one was, not past it (the after-the-last-note rule of f72dce717
  could not find it). Unit test added.
- Vermont brief-on-the-merits latex: the committed PDF predated the em dash/quotation
  mark no-break rule (lib/latex/xdoc.lua dash_quotes); re-rendered, now as typst.

Re-rendered outputs and check stamps for the five folders.

Co-Authored-By: Claude Opus 5.5 <noreply@anthropic.com>
Gate: fb-595-90-a1 f3b317b4a22bb7838e0d9f0f1827c448d6fe1978
</commit_message>
<xml_diff>
--- a/courts/eleventh-circuit/court-of-appeals/answering-brief/usage/OUTPUT-answering-brief.docx
+++ b/courts/eleventh-circuit/court-of-appeals/answering-brief/usage/OUTPUT-answering-brief.docx
@@ -19,9 +19,7 @@
           <w:b/>
           <w:bCs/>
         </w:rPr>
-        <w:t xml:space="preserve">25</w:t>
-        <w:noBreakHyphen/>
-        <w:t xml:space="preserve">12813</w:t>
+        <w:t xml:space="preserve">25-⁠12813</w:t>
       </w:r>
       <w:r>
         <w:rPr>
@@ -77,9 +75,7 @@
           <w:b/>
           <w:bCs/>
         </w:rPr>
-        <w:t xml:space="preserve">24</w:t>
-        <w:noBreakHyphen/>
-        <w:t xml:space="preserve">11892)</w:t>
+        <w:t xml:space="preserve">24-⁠11892)</w:t>
       </w:r>
     </w:p>
     <w:p>
@@ -694,9 +690,7 @@
                 <w:i/>
                 <w:iCs/>
               </w:rPr>
-              <w:t xml:space="preserve">656</w:t>
-              <w:noBreakHyphen/>
-              <w:t xml:space="preserve">0177</w:t>
+              <w:t xml:space="preserve">656-⁠0177</w:t>
             </w:r>
           </w:p>
         </w:tc>
@@ -952,9 +946,7 @@
                 <w:i/>
                 <w:iCs/>
               </w:rPr>
-              <w:t xml:space="preserve">968</w:t>
-              <w:noBreakHyphen/>
-              <w:t xml:space="preserve">4490</w:t>
+              <w:t xml:space="preserve">968-⁠4490</w:t>
             </w:r>
           </w:p>
         </w:tc>
@@ -1156,9 +1148,7 @@
                 <w:i/>
                 <w:iCs/>
               </w:rPr>
-              <w:t xml:space="preserve">32802</w:t>
-              <w:noBreakHyphen/>
-              <w:t xml:space="preserve">1631</w:t>
+              <w:t xml:space="preserve">32802-⁠1631</w:t>
             </w:r>
           </w:p>
           <w:p>
@@ -1187,9 +1177,7 @@
                 <w:i/>
                 <w:iCs/>
               </w:rPr>
-              <w:t xml:space="preserve">422</w:t>
-              <w:noBreakHyphen/>
-              <w:t xml:space="preserve">2472</w:t>
+              <w:t xml:space="preserve">422-⁠2472</w:t>
             </w:r>
           </w:p>
         </w:tc>
@@ -3498,11 +3486,7 @@
         <w:t xml:space="preserve"> </w:t>
       </w:r>
       <w:r>
-        <w:t xml:space="preserve">50</w:t>
-        <w:noBreakHyphen/>
-        <w:t xml:space="preserve">36</w:t>
-        <w:noBreakHyphen/>
-        <w:t xml:space="preserve">1</w:t>
+        <w:t xml:space="preserve">50-⁠36-⁠1</w:t>
       </w:r>
       <w:r>
         <w:t xml:space="preserve">   </w:t>
@@ -3682,7 +3666,7 @@
         <w:pStyle w:val="BodyText"/>
       </w:pPr>
       <w:r>
-        <w:t xml:space="preserve">In May 2023, Florida enacted into law SB 7050, imposing new rules and restrictions governing third-party voter registration organizations (“3PVROs”). This appeal involves only one provision: SB 7050’s Citizenship Requirement, which requires all 3PVROs to affirm “that each person collecting or handling voter registration applications” on their behalf “is a citizen of the United States of America,” and subjects the 3PVROs to a $50,000 fine “for each such person who is not a citizen.” Fla. Stat. § 97.0575(1)(f).</w:t>
+        <w:t xml:space="preserve">In May 2023, Florida enacted into law SB 7050, imposing new rules and restrictions governing third-party voter registration organizations (“3PVROs”). This appeal involves only one provision: SB 7050’s Citizenship Requirement, which requires all 3PVROs to affirm “that each person collecting or handling voter registration applications” on their behalf “is a citizen of the United States of America,” and subjects the 3PVROs to a $50,000 fine “for each such person who is not a citizen.” Fla. Stat. § 97.0575(1)⁠(f).</w:t>
       </w:r>
     </w:p>
     <w:p>
@@ -4550,7 +4534,7 @@
         <w:t xml:space="preserve">Shen v. Comm’r, Fla. Dep’t of Agric. &amp; Consumer Servs.</w:t>
       </w:r>
       <w:r>
-        <w:t xml:space="preserve">, 158 F.4th 1227, 1251 (11th Cir. 2025) (“Alienage generally refers to whether a person is a United States citizen.”). Florida’s Citizenship Requirement distinguishes between two categories of Florida residents: citizens and noncitizens. Fla. Stat. § 97.0575(1)(f). While the Eleventh Circuit has applied lower levels of scrutiny to laws that regulate only undocumented noncitizens,</w:t>
+        <w:t xml:space="preserve">, 158 F.4th 1227, 1251 (11th Cir. 2025) (“Alienage generally refers to whether a person is a United States citizen.”). Florida’s Citizenship Requirement distinguishes between two categories of Florida residents: citizens and noncitizens. Fla. Stat. § 97.0575(1)⁠(f). While the Eleventh Circuit has applied lower levels of scrutiny to laws that regulate only undocumented noncitizens,</w:t>
       </w:r>
       <w:r>
         <w:t xml:space="preserve"> </w:t>
@@ -4576,19 +4560,7 @@
         <w:t xml:space="preserve">Estrada v. Becker</w:t>
       </w:r>
       <w:r>
-        <w:t xml:space="preserve">, 917 F.3d 1298, 1301 (11th Cir. 2019) (applying rational basis review to statute prohibiting individuals “not lawfully in the United States” from attending certain Georgia universities (quoting O.C.G.A. § 50</w:t>
-      </w:r>
-      <w:r>
-        <w:noBreakHyphen/>
-      </w:r>
-      <w:r>
-        <w:t xml:space="preserve">36</w:t>
-      </w:r>
-      <w:r>
-        <w:noBreakHyphen/>
-      </w:r>
-      <w:r>
-        <w:t xml:space="preserve">1(d)(7)));</w:t>
+        <w:t xml:space="preserve">, 917 F.3d 1298, 1301 (11th Cir. 2019) (applying rational basis review to statute prohibiting individuals “not lawfully in the United States” from attending certain Georgia universities (quoting O.C.G.A. § 50-⁠36-⁠1(d)⁠(7)));</w:t>
       </w:r>
       <w:r>
         <w:t xml:space="preserve"> </w:t>
@@ -4617,7 +4589,7 @@
         <w:t xml:space="preserve"> </w:t>
       </w:r>
       <w:r>
-        <w:t xml:space="preserve">Fla. Stat. § 97.0575(1)(f) (requiring “affirmation that each person collecting or handling voter registration applications on behalf of the third-party voter registration organization is a citizen of the United States of America”). Its categorical restriction on all noncitizens is thus the emblematic “classification[] based on alienage” that triggers strict scrutiny.</w:t>
+        <w:t xml:space="preserve">Fla. Stat. § 97.0575(1)⁠(f) (requiring “affirmation that each person collecting or handling voter registration applications on behalf of the third-party voter registration organization is a citizen of the United States of America”). Its categorical restriction on all noncitizens is thus the emblematic “classification[] based on alienage” that triggers strict scrutiny.</w:t>
       </w:r>
       <w:r>
         <w:t xml:space="preserve"> </w:t>
@@ -4980,9 +4952,7 @@
           <w:i/>
           <w:iCs/>
         </w:rPr>
-        <w:t xml:space="preserve">32802</w:t>
-        <w:noBreakHyphen/>
-        <w:t xml:space="preserve">1631</w:t>
+        <w:t xml:space="preserve">32802-⁠1631</w:t>
       </w:r>
     </w:p>
     <w:p>
@@ -5025,9 +4995,7 @@
           <w:i/>
           <w:iCs/>
         </w:rPr>
-        <w:t xml:space="preserve">422</w:t>
-        <w:noBreakHyphen/>
-        <w:t xml:space="preserve">2472</w:t>
+        <w:t xml:space="preserve">422-⁠2472</w:t>
       </w:r>
     </w:p>
     <w:p>
@@ -5091,9 +5059,7 @@
         <w:ind w:left="0" w:firstLine="0"/>
       </w:pPr>
       <w:r>
-        <w:t xml:space="preserve">This brief complies with the type-volume limit of Fed. R. App. P. 32(a)(7)(B) because, excluding the parts of the brief exempted by Fed. R. App. P. 32(f) and 11th Cir. R. 32</w:t>
-        <w:noBreakHyphen/>
-        <w:t xml:space="preserve">4, it contains 1,428 words.</w:t>
+        <w:t xml:space="preserve">This brief complies with the type-volume limit of Fed. R. App. P. 32(a)⁠(7)⁠(B) because, excluding the parts of the brief exempted by Fed. R. App. P. 32(f) and 11th Cir. R. 32-⁠4, it contains 1,428 words.</w:t>
       </w:r>
     </w:p>
     <w:p>
@@ -5102,7 +5068,7 @@
         <w:ind w:left="0" w:firstLine="0"/>
       </w:pPr>
       <w:r>
-        <w:t xml:space="preserve">This brief complies with the typeface requirements of Fed. R. App. P. 32(a)(5) and the type-style requirements of Fed. R. App. P. 32(a)(6) because it has been prepared in a proportionally spaced typeface, Times New Roman, 14-point.</w:t>
+        <w:t xml:space="preserve">This brief complies with the typeface requirements of Fed. R. App. P. 32(a)⁠(5) and the type-style requirements of Fed. R. App. P. 32(a)⁠(6) because it has been prepared in a proportionally spaced typeface, Times New Roman, 14-point.</w:t>
       </w:r>
     </w:p>
     <w:p>

</xml_diff>